<commit_message>
fix: set CV apprenticeship title
</commit_message>
<xml_diff>
--- a/output/word/CV-Jean-Marc-Jorite.docx
+++ b/output/word/CV-Jean-Marc-Jorite.docx
@@ -34,12 +34,7 @@
         <w:spacing w:after="60"/>
       </w:pPr>
       <w:r>
-        <w:rPr>
-          <w:rFonts w:ascii="Aptos" w:hAnsi="Aptos"/>
-          <w:b w:val="0"/>
-          <w:sz w:val="17"/>
-        </w:rPr>
-        <w:t>ARletecrhnearncchee - d C'ahpefp dreen ptrisosjeatg SeI jeunn iMora s- tEeRrP M eItA mGéEtiers et applications métiers</w:t>
+        <w:t>Recherche d'apprentissage en Master MIAGE</w:t>
       </w:r>
     </w:p>
     <w:p>

</xml_diff>